<commit_message>
fix: rebuild orcamento.docx, briefing.docx and termo-transferencia.docx from scratch via docx (the same generation library already used successfully for contrato.docx and termo-manutencao.docx). Root cause: these 3 files carried an older document.xml header pattern (missing/misplaced mc:Ignorable, no standalone declaration) inherited from the original template batch, which LibreOffice/python-docx tolerated but real MS Word rejected as unreadable. Content, merge fields and docxtemplater loop tags ({#landingCatalog}, {#siteCatalog}, {#additionalItems}) preserved exactly; only the underlying XML generation changed.
</commit_message>
<xml_diff>
--- a/public/templates/orcamento.docx
+++ b/public/templates/orcamento.docx
@@ -4,7 +4,7 @@
   <w:body>
     <w:p>
       <w:pPr>
-        <w:spacing w:after="60"/>
+        <w:spacing w:after="40"/>
         <w:jc w:val="center"/>
       </w:pPr>
       <w:r>
@@ -12,15 +12,15 @@
           <w:rFonts w:ascii="Calibri" w:cs="Calibri" w:eastAsia="Calibri" w:hAnsi="Calibri"/>
           <w:b/>
           <w:bCs/>
-          <w:sz w:val="30"/>
-          <w:szCs w:val="30"/>
+          <w:sz w:val="28"/>
+          <w:szCs w:val="28"/>
         </w:rPr>
         <w:t xml:space="preserve">ORÇAMENTO DE DESENVOLVIMENTO DE SITE</w:t>
       </w:r>
     </w:p>
     <w:p>
       <w:pPr>
-        <w:spacing w:after="260"/>
+        <w:spacing w:after="200"/>
         <w:jc w:val="center"/>
       </w:pPr>
       <w:r>
@@ -28,16 +28,18 @@
           <w:rFonts w:ascii="Calibri" w:cs="Calibri" w:eastAsia="Calibri" w:hAnsi="Calibri"/>
           <w:b/>
           <w:bCs/>
-          <w:color w:val="444444"/>
-          <w:sz w:val="20"/>
-          <w:szCs w:val="20"/>
+          <w:i/>
+          <w:iCs/>
+          <w:sz w:val="22"/>
+          <w:szCs w:val="22"/>
         </w:rPr>
         <w:t xml:space="preserve">ēloSites — modelo padrão, preencher por cliente</w:t>
       </w:r>
     </w:p>
     <w:p>
       <w:pPr>
-        <w:spacing w:after="80"/>
+        <w:spacing w:after="160"/>
+        <w:jc w:val="both"/>
       </w:pPr>
       <w:r>
         <w:rPr>
@@ -54,7 +56,6 @@
           <w:rFonts w:ascii="Calibri" w:cs="Calibri" w:eastAsia="Calibri" w:hAnsi="Calibri"/>
           <w:i/>
           <w:iCs/>
-          <w:color w:val="555555"/>
           <w:sz w:val="22"/>
           <w:szCs w:val="22"/>
         </w:rPr>
@@ -63,7 +64,8 @@
     </w:p>
     <w:p>
       <w:pPr>
-        <w:spacing w:after="80"/>
+        <w:spacing w:after="160"/>
+        <w:jc w:val="both"/>
       </w:pPr>
       <w:r>
         <w:rPr>
@@ -80,7 +82,6 @@
           <w:rFonts w:ascii="Calibri" w:cs="Calibri" w:eastAsia="Calibri" w:hAnsi="Calibri"/>
           <w:i/>
           <w:iCs/>
-          <w:color w:val="555555"/>
           <w:sz w:val="22"/>
           <w:szCs w:val="22"/>
         </w:rPr>
@@ -89,7 +90,8 @@
     </w:p>
     <w:p>
       <w:pPr>
-        <w:spacing w:after="80"/>
+        <w:spacing w:after="160"/>
+        <w:jc w:val="both"/>
       </w:pPr>
       <w:r>
         <w:rPr>
@@ -106,7 +108,6 @@
           <w:rFonts w:ascii="Calibri" w:cs="Calibri" w:eastAsia="Calibri" w:hAnsi="Calibri"/>
           <w:i/>
           <w:iCs/>
-          <w:color w:val="555555"/>
           <w:sz w:val="22"/>
           <w:szCs w:val="22"/>
         </w:rPr>
@@ -115,7 +116,8 @@
     </w:p>
     <w:p>
       <w:pPr>
-        <w:spacing w:after="80"/>
+        <w:spacing w:after="160"/>
+        <w:jc w:val="both"/>
       </w:pPr>
       <w:r>
         <w:rPr>
@@ -132,16 +134,16 @@
           <w:rFonts w:ascii="Calibri" w:cs="Calibri" w:eastAsia="Calibri" w:hAnsi="Calibri"/>
           <w:i/>
           <w:iCs/>
-          <w:color w:val="555555"/>
-          <w:sz w:val="22"/>
-          <w:szCs w:val="22"/>
-        </w:rPr>
-        <w:t xml:space="preserve">[{landingMark}] Landing page   [{siteMark}] Site institucional   [{otherMark}] Projeto Personalizado</w:t>
-      </w:r>
-    </w:p>
-    <w:p>
-      <w:pPr>
-        <w:spacing w:after="80"/>
+          <w:sz w:val="22"/>
+          <w:szCs w:val="22"/>
+        </w:rPr>
+        <w:t xml:space="preserve">[{landingMark}] Landing page  [{siteMark}] Site institucional  [{otherMark}] Projeto Personalizado</w:t>
+      </w:r>
+    </w:p>
+    <w:p>
+      <w:pPr>
+        <w:spacing w:after="160"/>
+        <w:jc w:val="both"/>
       </w:pPr>
       <w:r>
         <w:rPr>
@@ -158,7 +160,6 @@
           <w:rFonts w:ascii="Calibri" w:cs="Calibri" w:eastAsia="Calibri" w:hAnsi="Calibri"/>
           <w:i/>
           <w:iCs/>
-          <w:color w:val="555555"/>
           <w:sz w:val="22"/>
           <w:szCs w:val="22"/>
         </w:rPr>
@@ -167,7 +168,8 @@
     </w:p>
     <w:p>
       <w:pPr>
-        <w:spacing w:after="80"/>
+        <w:spacing w:after="160"/>
+        <w:jc w:val="both"/>
       </w:pPr>
       <w:r>
         <w:rPr>
@@ -184,7 +186,6 @@
           <w:rFonts w:ascii="Calibri" w:cs="Calibri" w:eastAsia="Calibri" w:hAnsi="Calibri"/>
           <w:i/>
           <w:iCs/>
-          <w:color w:val="555555"/>
           <w:sz w:val="22"/>
           <w:szCs w:val="22"/>
         </w:rPr>
@@ -194,15 +195,21 @@
     <w:p>
       <w:pPr>
         <w:pStyle w:val="Heading1"/>
-        <w:spacing w:after="120" w:before="260"/>
-      </w:pPr>
-      <w:r>
+        <w:spacing w:after="130" w:before="260"/>
+      </w:pPr>
+      <w:r>
+        <w:rPr>
+          <w:rFonts w:ascii="Calibri" w:cs="Calibri" w:eastAsia="Calibri" w:hAnsi="Calibri"/>
+          <w:color w:val="2E74B5"/>
+          <w:sz w:val="28"/>
+          <w:szCs w:val="28"/>
+        </w:rPr>
         <w:t xml:space="preserve">Catálogo padrão — marque o que entra neste orçamento</w:t>
       </w:r>
     </w:p>
     <w:p>
       <w:pPr>
-        <w:spacing w:after="130"/>
+        <w:spacing w:after="160"/>
         <w:jc w:val="both"/>
       </w:pPr>
       <w:r>
@@ -216,10 +223,17 @@
     </w:p>
     <w:p>
       <w:pPr>
-        <w:pStyle w:val="Heading2"/>
-        <w:spacing w:after="90" w:before="180"/>
-      </w:pPr>
-      <w:r>
+        <w:spacing w:after="160"/>
+        <w:jc w:val="both"/>
+      </w:pPr>
+      <w:r>
+        <w:rPr>
+          <w:rFonts w:ascii="Calibri" w:cs="Calibri" w:eastAsia="Calibri" w:hAnsi="Calibri"/>
+          <w:b/>
+          <w:bCs/>
+          <w:sz w:val="22"/>
+          <w:szCs w:val="22"/>
+        </w:rPr>
         <w:t xml:space="preserve">Se Landing page:</w:t>
       </w:r>
     </w:p>
@@ -242,25 +256,32 @@
       <w:tr>
         <w:tc>
           <w:tcPr>
-            <w:tcW w:type="pct" w:w="14%"/>
-            <w:shd w:fill="1F2937" w:color="auto" w:val="clear"/>
+            <w:tcW w:type="pct" w:w="22%"/>
+            <w:tcBorders>
+              <w:top w:val="single" w:color="CCCCCC" w:sz="4"/>
+              <w:left w:val="single" w:color="CCCCCC" w:sz="4"/>
+              <w:bottom w:val="single" w:color="CCCCCC" w:sz="4"/>
+              <w:right w:val="single" w:color="CCCCCC" w:sz="4"/>
+            </w:tcBorders>
+            <w:shd w:fill="EEF3FA"/>
             <w:tcMar>
-              <w:top w:type="dxa" w:w="90"/>
-              <w:left w:type="dxa" w:w="110"/>
-              <w:bottom w:type="dxa" w:w="90"/>
-              <w:right w:type="dxa" w:w="110"/>
+              <w:top w:type="dxa" w:w="60"/>
+              <w:left w:type="dxa" w:w="100"/>
+              <w:bottom w:type="dxa" w:w="60"/>
+              <w:right w:type="dxa" w:w="100"/>
             </w:tcMar>
-            <w:vAlign w:val="center"/>
           </w:tcPr>
           <w:p>
+            <w:pPr>
+              <w:spacing w:after="40"/>
+            </w:pPr>
             <w:r>
               <w:rPr>
                 <w:rFonts w:ascii="Calibri" w:cs="Calibri" w:eastAsia="Calibri" w:hAnsi="Calibri"/>
                 <w:b/>
                 <w:bCs/>
-                <w:color w:val="FFFFFF"/>
-                <w:sz w:val="19"/>
-                <w:szCs w:val="19"/>
+                <w:sz w:val="22"/>
+                <w:szCs w:val="22"/>
               </w:rPr>
               <w:t xml:space="preserve">Incluso?</w:t>
             </w:r>
@@ -268,25 +289,32 @@
         </w:tc>
         <w:tc>
           <w:tcPr>
-            <w:tcW w:type="pct" w:w="86%"/>
-            <w:shd w:fill="1F2937" w:color="auto" w:val="clear"/>
+            <w:tcW w:type="pct" w:w="78%"/>
+            <w:tcBorders>
+              <w:top w:val="single" w:color="CCCCCC" w:sz="4"/>
+              <w:left w:val="single" w:color="CCCCCC" w:sz="4"/>
+              <w:bottom w:val="single" w:color="CCCCCC" w:sz="4"/>
+              <w:right w:val="single" w:color="CCCCCC" w:sz="4"/>
+            </w:tcBorders>
+            <w:shd w:fill="EEF3FA"/>
             <w:tcMar>
-              <w:top w:type="dxa" w:w="90"/>
-              <w:left w:type="dxa" w:w="110"/>
-              <w:bottom w:type="dxa" w:w="90"/>
-              <w:right w:type="dxa" w:w="110"/>
+              <w:top w:type="dxa" w:w="60"/>
+              <w:left w:type="dxa" w:w="100"/>
+              <w:bottom w:type="dxa" w:w="60"/>
+              <w:right w:type="dxa" w:w="100"/>
             </w:tcMar>
-            <w:vAlign w:val="center"/>
           </w:tcPr>
           <w:p>
+            <w:pPr>
+              <w:spacing w:after="40"/>
+            </w:pPr>
             <w:r>
               <w:rPr>
                 <w:rFonts w:ascii="Calibri" w:cs="Calibri" w:eastAsia="Calibri" w:hAnsi="Calibri"/>
                 <w:b/>
                 <w:bCs/>
-                <w:color w:val="FFFFFF"/>
-                <w:sz w:val="19"/>
-                <w:szCs w:val="19"/>
+                <w:sz w:val="22"/>
+                <w:szCs w:val="22"/>
               </w:rPr>
               <w:t xml:space="preserve">Item padrão do catálogo</w:t>
             </w:r>
@@ -296,23 +324,29 @@
       <w:tr>
         <w:tc>
           <w:tcPr>
+            <w:tcW w:type="pct" w:w="22%"/>
+            <w:tcBorders>
+              <w:top w:val="single" w:color="CCCCCC" w:sz="4"/>
+              <w:left w:val="single" w:color="CCCCCC" w:sz="4"/>
+              <w:bottom w:val="single" w:color="CCCCCC" w:sz="4"/>
+              <w:right w:val="single" w:color="CCCCCC" w:sz="4"/>
+            </w:tcBorders>
             <w:tcMar>
-              <w:top w:type="dxa" w:w="90"/>
-              <w:left w:type="dxa" w:w="110"/>
-              <w:bottom w:type="dxa" w:w="90"/>
-              <w:right w:type="dxa" w:w="110"/>
+              <w:top w:type="dxa" w:w="60"/>
+              <w:left w:type="dxa" w:w="100"/>
+              <w:bottom w:type="dxa" w:w="60"/>
+              <w:right w:type="dxa" w:w="100"/>
             </w:tcMar>
-            <w:vAlign w:val="center"/>
           </w:tcPr>
           <w:p>
+            <w:pPr>
+              <w:spacing w:after="40"/>
+            </w:pPr>
             <w:r>
               <w:rPr>
                 <w:rFonts w:ascii="Calibri" w:cs="Calibri" w:eastAsia="Calibri" w:hAnsi="Calibri"/>
-                <w:b w:val="false"/>
-                <w:bCs w:val="false"/>
-                <w:color w:val="000000"/>
-                <w:sz w:val="20"/>
-                <w:szCs w:val="20"/>
+                <w:sz w:val="22"/>
+                <w:szCs w:val="22"/>
               </w:rPr>
               <w:t xml:space="preserve">{#landingCatalog}[{mark}]</w:t>
             </w:r>
@@ -320,23 +354,29 @@
         </w:tc>
         <w:tc>
           <w:tcPr>
+            <w:tcW w:type="pct" w:w="78%"/>
+            <w:tcBorders>
+              <w:top w:val="single" w:color="CCCCCC" w:sz="4"/>
+              <w:left w:val="single" w:color="CCCCCC" w:sz="4"/>
+              <w:bottom w:val="single" w:color="CCCCCC" w:sz="4"/>
+              <w:right w:val="single" w:color="CCCCCC" w:sz="4"/>
+            </w:tcBorders>
             <w:tcMar>
-              <w:top w:type="dxa" w:w="90"/>
-              <w:left w:type="dxa" w:w="110"/>
-              <w:bottom w:type="dxa" w:w="90"/>
-              <w:right w:type="dxa" w:w="110"/>
+              <w:top w:type="dxa" w:w="60"/>
+              <w:left w:type="dxa" w:w="100"/>
+              <w:bottom w:type="dxa" w:w="60"/>
+              <w:right w:type="dxa" w:w="100"/>
             </w:tcMar>
-            <w:vAlign w:val="center"/>
           </w:tcPr>
           <w:p>
+            <w:pPr>
+              <w:spacing w:after="40"/>
+            </w:pPr>
             <w:r>
               <w:rPr>
                 <w:rFonts w:ascii="Calibri" w:cs="Calibri" w:eastAsia="Calibri" w:hAnsi="Calibri"/>
-                <w:b w:val="false"/>
-                <w:bCs w:val="false"/>
-                <w:color w:val="000000"/>
-                <w:sz w:val="20"/>
-                <w:szCs w:val="20"/>
+                <w:sz w:val="22"/>
+                <w:szCs w:val="22"/>
               </w:rPr>
               <w:t xml:space="preserve">{label}{/}</w:t>
             </w:r>
@@ -346,23 +386,29 @@
       <w:tr>
         <w:tc>
           <w:tcPr>
+            <w:tcW w:type="pct" w:w="22%"/>
+            <w:tcBorders>
+              <w:top w:val="single" w:color="CCCCCC" w:sz="4"/>
+              <w:left w:val="single" w:color="CCCCCC" w:sz="4"/>
+              <w:bottom w:val="single" w:color="CCCCCC" w:sz="4"/>
+              <w:right w:val="single" w:color="CCCCCC" w:sz="4"/>
+            </w:tcBorders>
             <w:tcMar>
-              <w:top w:type="dxa" w:w="90"/>
-              <w:left w:type="dxa" w:w="110"/>
-              <w:bottom w:type="dxa" w:w="90"/>
-              <w:right w:type="dxa" w:w="110"/>
+              <w:top w:type="dxa" w:w="60"/>
+              <w:left w:type="dxa" w:w="100"/>
+              <w:bottom w:type="dxa" w:w="60"/>
+              <w:right w:type="dxa" w:w="100"/>
             </w:tcMar>
-            <w:vAlign w:val="center"/>
           </w:tcPr>
           <w:p>
+            <w:pPr>
+              <w:spacing w:after="40"/>
+            </w:pPr>
             <w:r>
               <w:rPr>
                 <w:rFonts w:ascii="Calibri" w:cs="Calibri" w:eastAsia="Calibri" w:hAnsi="Calibri"/>
-                <w:b w:val="false"/>
-                <w:bCs w:val="false"/>
-                <w:color w:val="000000"/>
-                <w:sz w:val="20"/>
-                <w:szCs w:val="20"/>
+                <w:sz w:val="22"/>
+                <w:szCs w:val="22"/>
               </w:rPr>
               <w:t xml:space="preserve">[X]</w:t>
             </w:r>
@@ -370,23 +416,29 @@
         </w:tc>
         <w:tc>
           <w:tcPr>
+            <w:tcW w:type="pct" w:w="78%"/>
+            <w:tcBorders>
+              <w:top w:val="single" w:color="CCCCCC" w:sz="4"/>
+              <w:left w:val="single" w:color="CCCCCC" w:sz="4"/>
+              <w:bottom w:val="single" w:color="CCCCCC" w:sz="4"/>
+              <w:right w:val="single" w:color="CCCCCC" w:sz="4"/>
+            </w:tcBorders>
             <w:tcMar>
-              <w:top w:type="dxa" w:w="90"/>
-              <w:left w:type="dxa" w:w="110"/>
-              <w:bottom w:type="dxa" w:w="90"/>
-              <w:right w:type="dxa" w:w="110"/>
+              <w:top w:type="dxa" w:w="60"/>
+              <w:left w:type="dxa" w:w="100"/>
+              <w:bottom w:type="dxa" w:w="60"/>
+              <w:right w:type="dxa" w:w="100"/>
             </w:tcMar>
-            <w:vAlign w:val="center"/>
           </w:tcPr>
           <w:p>
+            <w:pPr>
+              <w:spacing w:after="40"/>
+            </w:pPr>
             <w:r>
               <w:rPr>
                 <w:rFonts w:ascii="Calibri" w:cs="Calibri" w:eastAsia="Calibri" w:hAnsi="Calibri"/>
-                <w:b w:val="false"/>
-                <w:bCs w:val="false"/>
-                <w:color w:val="000000"/>
-                <w:sz w:val="20"/>
-                <w:szCs w:val="20"/>
+                <w:sz w:val="22"/>
+                <w:szCs w:val="22"/>
               </w:rPr>
               <w:t xml:space="preserve">Rodada(s) de revisão: {reviewRounds}</w:t>
             </w:r>
@@ -396,15 +448,22 @@
     </w:tbl>
     <w:p>
       <w:pPr>
-        <w:spacing w:before="160"/>
-      </w:pPr>
-    </w:p>
-    <w:p>
-      <w:pPr>
-        <w:pStyle w:val="Heading2"/>
-        <w:spacing w:after="90" w:before="180"/>
-      </w:pPr>
-      <w:r>
+        <w:spacing w:after="160"/>
+      </w:pPr>
+    </w:p>
+    <w:p>
+      <w:pPr>
+        <w:spacing w:after="160"/>
+        <w:jc w:val="both"/>
+      </w:pPr>
+      <w:r>
+        <w:rPr>
+          <w:rFonts w:ascii="Calibri" w:cs="Calibri" w:eastAsia="Calibri" w:hAnsi="Calibri"/>
+          <w:b/>
+          <w:bCs/>
+          <w:sz w:val="22"/>
+          <w:szCs w:val="22"/>
+        </w:rPr>
         <w:t xml:space="preserve">Se Site institucional:</w:t>
       </w:r>
     </w:p>
@@ -427,25 +486,32 @@
       <w:tr>
         <w:tc>
           <w:tcPr>
-            <w:tcW w:type="pct" w:w="14%"/>
-            <w:shd w:fill="1F2937" w:color="auto" w:val="clear"/>
+            <w:tcW w:type="pct" w:w="22%"/>
+            <w:tcBorders>
+              <w:top w:val="single" w:color="CCCCCC" w:sz="4"/>
+              <w:left w:val="single" w:color="CCCCCC" w:sz="4"/>
+              <w:bottom w:val="single" w:color="CCCCCC" w:sz="4"/>
+              <w:right w:val="single" w:color="CCCCCC" w:sz="4"/>
+            </w:tcBorders>
+            <w:shd w:fill="EEF3FA"/>
             <w:tcMar>
-              <w:top w:type="dxa" w:w="90"/>
-              <w:left w:type="dxa" w:w="110"/>
-              <w:bottom w:type="dxa" w:w="90"/>
-              <w:right w:type="dxa" w:w="110"/>
+              <w:top w:type="dxa" w:w="60"/>
+              <w:left w:type="dxa" w:w="100"/>
+              <w:bottom w:type="dxa" w:w="60"/>
+              <w:right w:type="dxa" w:w="100"/>
             </w:tcMar>
-            <w:vAlign w:val="center"/>
           </w:tcPr>
           <w:p>
+            <w:pPr>
+              <w:spacing w:after="40"/>
+            </w:pPr>
             <w:r>
               <w:rPr>
                 <w:rFonts w:ascii="Calibri" w:cs="Calibri" w:eastAsia="Calibri" w:hAnsi="Calibri"/>
                 <w:b/>
                 <w:bCs/>
-                <w:color w:val="FFFFFF"/>
-                <w:sz w:val="19"/>
-                <w:szCs w:val="19"/>
+                <w:sz w:val="22"/>
+                <w:szCs w:val="22"/>
               </w:rPr>
               <w:t xml:space="preserve">Incluso?</w:t>
             </w:r>
@@ -453,25 +519,32 @@
         </w:tc>
         <w:tc>
           <w:tcPr>
-            <w:tcW w:type="pct" w:w="86%"/>
-            <w:shd w:fill="1F2937" w:color="auto" w:val="clear"/>
+            <w:tcW w:type="pct" w:w="78%"/>
+            <w:tcBorders>
+              <w:top w:val="single" w:color="CCCCCC" w:sz="4"/>
+              <w:left w:val="single" w:color="CCCCCC" w:sz="4"/>
+              <w:bottom w:val="single" w:color="CCCCCC" w:sz="4"/>
+              <w:right w:val="single" w:color="CCCCCC" w:sz="4"/>
+            </w:tcBorders>
+            <w:shd w:fill="EEF3FA"/>
             <w:tcMar>
-              <w:top w:type="dxa" w:w="90"/>
-              <w:left w:type="dxa" w:w="110"/>
-              <w:bottom w:type="dxa" w:w="90"/>
-              <w:right w:type="dxa" w:w="110"/>
+              <w:top w:type="dxa" w:w="60"/>
+              <w:left w:type="dxa" w:w="100"/>
+              <w:bottom w:type="dxa" w:w="60"/>
+              <w:right w:type="dxa" w:w="100"/>
             </w:tcMar>
-            <w:vAlign w:val="center"/>
           </w:tcPr>
           <w:p>
+            <w:pPr>
+              <w:spacing w:after="40"/>
+            </w:pPr>
             <w:r>
               <w:rPr>
                 <w:rFonts w:ascii="Calibri" w:cs="Calibri" w:eastAsia="Calibri" w:hAnsi="Calibri"/>
                 <w:b/>
                 <w:bCs/>
-                <w:color w:val="FFFFFF"/>
-                <w:sz w:val="19"/>
-                <w:szCs w:val="19"/>
+                <w:sz w:val="22"/>
+                <w:szCs w:val="22"/>
               </w:rPr>
               <w:t xml:space="preserve">Item padrão do catálogo</w:t>
             </w:r>
@@ -481,23 +554,29 @@
       <w:tr>
         <w:tc>
           <w:tcPr>
+            <w:tcW w:type="pct" w:w="22%"/>
+            <w:tcBorders>
+              <w:top w:val="single" w:color="CCCCCC" w:sz="4"/>
+              <w:left w:val="single" w:color="CCCCCC" w:sz="4"/>
+              <w:bottom w:val="single" w:color="CCCCCC" w:sz="4"/>
+              <w:right w:val="single" w:color="CCCCCC" w:sz="4"/>
+            </w:tcBorders>
             <w:tcMar>
-              <w:top w:type="dxa" w:w="90"/>
-              <w:left w:type="dxa" w:w="110"/>
-              <w:bottom w:type="dxa" w:w="90"/>
-              <w:right w:type="dxa" w:w="110"/>
+              <w:top w:type="dxa" w:w="60"/>
+              <w:left w:type="dxa" w:w="100"/>
+              <w:bottom w:type="dxa" w:w="60"/>
+              <w:right w:type="dxa" w:w="100"/>
             </w:tcMar>
-            <w:vAlign w:val="center"/>
           </w:tcPr>
           <w:p>
+            <w:pPr>
+              <w:spacing w:after="40"/>
+            </w:pPr>
             <w:r>
               <w:rPr>
                 <w:rFonts w:ascii="Calibri" w:cs="Calibri" w:eastAsia="Calibri" w:hAnsi="Calibri"/>
-                <w:b w:val="false"/>
-                <w:bCs w:val="false"/>
-                <w:color w:val="000000"/>
-                <w:sz w:val="20"/>
-                <w:szCs w:val="20"/>
+                <w:sz w:val="22"/>
+                <w:szCs w:val="22"/>
               </w:rPr>
               <w:t xml:space="preserve">{#siteCatalog}[{mark}]</w:t>
             </w:r>
@@ -505,23 +584,29 @@
         </w:tc>
         <w:tc>
           <w:tcPr>
+            <w:tcW w:type="pct" w:w="78%"/>
+            <w:tcBorders>
+              <w:top w:val="single" w:color="CCCCCC" w:sz="4"/>
+              <w:left w:val="single" w:color="CCCCCC" w:sz="4"/>
+              <w:bottom w:val="single" w:color="CCCCCC" w:sz="4"/>
+              <w:right w:val="single" w:color="CCCCCC" w:sz="4"/>
+            </w:tcBorders>
             <w:tcMar>
-              <w:top w:type="dxa" w:w="90"/>
-              <w:left w:type="dxa" w:w="110"/>
-              <w:bottom w:type="dxa" w:w="90"/>
-              <w:right w:type="dxa" w:w="110"/>
+              <w:top w:type="dxa" w:w="60"/>
+              <w:left w:type="dxa" w:w="100"/>
+              <w:bottom w:type="dxa" w:w="60"/>
+              <w:right w:type="dxa" w:w="100"/>
             </w:tcMar>
-            <w:vAlign w:val="center"/>
           </w:tcPr>
           <w:p>
+            <w:pPr>
+              <w:spacing w:after="40"/>
+            </w:pPr>
             <w:r>
               <w:rPr>
                 <w:rFonts w:ascii="Calibri" w:cs="Calibri" w:eastAsia="Calibri" w:hAnsi="Calibri"/>
-                <w:b w:val="false"/>
-                <w:bCs w:val="false"/>
-                <w:color w:val="000000"/>
-                <w:sz w:val="20"/>
-                <w:szCs w:val="20"/>
+                <w:sz w:val="22"/>
+                <w:szCs w:val="22"/>
               </w:rPr>
               <w:t xml:space="preserve">{label}{/}</w:t>
             </w:r>
@@ -531,23 +616,29 @@
       <w:tr>
         <w:tc>
           <w:tcPr>
+            <w:tcW w:type="pct" w:w="22%"/>
+            <w:tcBorders>
+              <w:top w:val="single" w:color="CCCCCC" w:sz="4"/>
+              <w:left w:val="single" w:color="CCCCCC" w:sz="4"/>
+              <w:bottom w:val="single" w:color="CCCCCC" w:sz="4"/>
+              <w:right w:val="single" w:color="CCCCCC" w:sz="4"/>
+            </w:tcBorders>
             <w:tcMar>
-              <w:top w:type="dxa" w:w="90"/>
-              <w:left w:type="dxa" w:w="110"/>
-              <w:bottom w:type="dxa" w:w="90"/>
-              <w:right w:type="dxa" w:w="110"/>
+              <w:top w:type="dxa" w:w="60"/>
+              <w:left w:type="dxa" w:w="100"/>
+              <w:bottom w:type="dxa" w:w="60"/>
+              <w:right w:type="dxa" w:w="100"/>
             </w:tcMar>
-            <w:vAlign w:val="center"/>
           </w:tcPr>
           <w:p>
+            <w:pPr>
+              <w:spacing w:after="40"/>
+            </w:pPr>
             <w:r>
               <w:rPr>
                 <w:rFonts w:ascii="Calibri" w:cs="Calibri" w:eastAsia="Calibri" w:hAnsi="Calibri"/>
-                <w:b w:val="false"/>
-                <w:bCs w:val="false"/>
-                <w:color w:val="000000"/>
-                <w:sz w:val="20"/>
-                <w:szCs w:val="20"/>
+                <w:sz w:val="22"/>
+                <w:szCs w:val="22"/>
               </w:rPr>
               <w:t xml:space="preserve">[X]</w:t>
             </w:r>
@@ -555,23 +646,29 @@
         </w:tc>
         <w:tc>
           <w:tcPr>
+            <w:tcW w:type="pct" w:w="78%"/>
+            <w:tcBorders>
+              <w:top w:val="single" w:color="CCCCCC" w:sz="4"/>
+              <w:left w:val="single" w:color="CCCCCC" w:sz="4"/>
+              <w:bottom w:val="single" w:color="CCCCCC" w:sz="4"/>
+              <w:right w:val="single" w:color="CCCCCC" w:sz="4"/>
+            </w:tcBorders>
             <w:tcMar>
-              <w:top w:type="dxa" w:w="90"/>
-              <w:left w:type="dxa" w:w="110"/>
-              <w:bottom w:type="dxa" w:w="90"/>
-              <w:right w:type="dxa" w:w="110"/>
+              <w:top w:type="dxa" w:w="60"/>
+              <w:left w:type="dxa" w:w="100"/>
+              <w:bottom w:type="dxa" w:w="60"/>
+              <w:right w:type="dxa" w:w="100"/>
             </w:tcMar>
-            <w:vAlign w:val="center"/>
           </w:tcPr>
           <w:p>
+            <w:pPr>
+              <w:spacing w:after="40"/>
+            </w:pPr>
             <w:r>
               <w:rPr>
                 <w:rFonts w:ascii="Calibri" w:cs="Calibri" w:eastAsia="Calibri" w:hAnsi="Calibri"/>
-                <w:b w:val="false"/>
-                <w:bCs w:val="false"/>
-                <w:color w:val="000000"/>
-                <w:sz w:val="20"/>
-                <w:szCs w:val="20"/>
+                <w:sz w:val="22"/>
+                <w:szCs w:val="22"/>
               </w:rPr>
               <w:t xml:space="preserve">Rodada(s) de revisão: {reviewRounds}</w:t>
             </w:r>
@@ -581,107 +678,175 @@
     </w:tbl>
     <w:p>
       <w:pPr>
-        <w:spacing w:before="160"/>
-      </w:pPr>
-    </w:p>
-    <w:p>
-      <w:pPr>
-        <w:pStyle w:val="Heading2"/>
-        <w:spacing w:after="90" w:before="180"/>
-      </w:pPr>
-      <w:r>
+        <w:spacing w:after="160"/>
+      </w:pPr>
+    </w:p>
+    <w:p>
+      <w:pPr>
+        <w:spacing w:after="160"/>
+        <w:jc w:val="both"/>
+      </w:pPr>
+      <w:r>
+        <w:rPr>
+          <w:rFonts w:ascii="Calibri" w:cs="Calibri" w:eastAsia="Calibri" w:hAnsi="Calibri"/>
+          <w:b/>
+          <w:bCs/>
+          <w:sz w:val="22"/>
+          <w:szCs w:val="22"/>
+        </w:rPr>
         <w:t xml:space="preserve">Não incluso (padrão em qualquer orçamento, salvo item adicional abaixo):</w:t>
       </w:r>
     </w:p>
     <w:p>
       <w:pPr>
-        <w:spacing w:after="50"/>
-      </w:pPr>
-      <w:r>
-        <w:rPr>
-          <w:rFonts w:ascii="Calibri" w:cs="Calibri" w:eastAsia="Calibri" w:hAnsi="Calibri"/>
-          <w:sz w:val="21"/>
-          <w:szCs w:val="21"/>
-        </w:rPr>
-        <w:t xml:space="preserve">• Domínio e hospedagem: serviços de terceiros contratados e pagos diretamente pelo(a) CONTRATANTE junto ao provedor de sua escolha (a ēloSites não comercializa esses serviços nem recebe comissão por sua contratação);</w:t>
-      </w:r>
-    </w:p>
-    <w:p>
-      <w:pPr>
-        <w:spacing w:after="50"/>
-      </w:pPr>
-      <w:r>
-        <w:rPr>
-          <w:rFonts w:ascii="Calibri" w:cs="Calibri" w:eastAsia="Calibri" w:hAnsi="Calibri"/>
-          <w:sz w:val="21"/>
-          <w:szCs w:val="21"/>
-        </w:rPr>
-        <w:t xml:space="preserve">• Configuração ou migração de domínio/hospedagem fora do escopo aprovado (pode ser orçada separadamente);</w:t>
-      </w:r>
-    </w:p>
-    <w:p>
-      <w:pPr>
-        <w:spacing w:after="50"/>
-      </w:pPr>
-      <w:r>
-        <w:rPr>
-          <w:rFonts w:ascii="Calibri" w:cs="Calibri" w:eastAsia="Calibri" w:hAnsi="Calibri"/>
-          <w:sz w:val="21"/>
-          <w:szCs w:val="21"/>
-        </w:rPr>
-        <w:t xml:space="preserve">• Criação de identidade visual (logotipo) do zero, quando não contratada</w:t>
-      </w:r>
-    </w:p>
-    <w:p>
-      <w:pPr>
-        <w:spacing w:after="50"/>
-      </w:pPr>
-      <w:r>
-        <w:rPr>
-          <w:rFonts w:ascii="Calibri" w:cs="Calibri" w:eastAsia="Calibri" w:hAnsi="Calibri"/>
-          <w:sz w:val="21"/>
-          <w:szCs w:val="21"/>
-        </w:rPr>
-        <w:t xml:space="preserve">• Novas páginas ou funcionalidades fora do escopo marcado acima</w:t>
-      </w:r>
-    </w:p>
-    <w:p>
-      <w:pPr>
-        <w:spacing w:after="50"/>
-      </w:pPr>
-      <w:r>
-        <w:rPr>
-          <w:rFonts w:ascii="Calibri" w:cs="Calibri" w:eastAsia="Calibri" w:hAnsi="Calibri"/>
-          <w:sz w:val="21"/>
-          <w:szCs w:val="21"/>
-        </w:rPr>
-        <w:t xml:space="preserve">• Integrações com sistemas de terceiros (CRM, pagamento, automação)</w:t>
-      </w:r>
-    </w:p>
-    <w:p>
-      <w:pPr>
-        <w:spacing w:after="50"/>
-      </w:pPr>
-      <w:r>
-        <w:rPr>
-          <w:rFonts w:ascii="Calibri" w:cs="Calibri" w:eastAsia="Calibri" w:hAnsi="Calibri"/>
-          <w:sz w:val="21"/>
-          <w:szCs w:val="21"/>
-        </w:rPr>
-        <w:t xml:space="preserve">• Produção de conteúdo (textos, fotos, vídeos) além do fornecido pelo cliente</w:t>
-      </w:r>
-    </w:p>
-    <w:p>
-      <w:pPr>
-        <w:spacing w:before="200"/>
-      </w:pPr>
+        <w:spacing w:after="90"/>
+        <w:ind w:left="340" w:hanging="340"/>
+        <w:jc w:val="both"/>
+      </w:pPr>
+      <w:r>
+        <w:rPr>
+          <w:rFonts w:ascii="Calibri" w:cs="Calibri" w:eastAsia="Calibri" w:hAnsi="Calibri"/>
+          <w:sz w:val="22"/>
+          <w:szCs w:val="22"/>
+        </w:rPr>
+        <w:t xml:space="preserve">•  </w:t>
+      </w:r>
+      <w:r>
+        <w:rPr>
+          <w:rFonts w:ascii="Calibri" w:cs="Calibri" w:eastAsia="Calibri" w:hAnsi="Calibri"/>
+          <w:sz w:val="22"/>
+          <w:szCs w:val="22"/>
+        </w:rPr>
+        <w:t xml:space="preserve">Domínio e hospedagem: serviços de terceiros contratados e pagos diretamente pelo(a) CONTRATANTE junto ao provedor de sua escolha (a ēloSites não comercializa esses serviços nem recebe comissão por sua contratação);</w:t>
+      </w:r>
+    </w:p>
+    <w:p>
+      <w:pPr>
+        <w:spacing w:after="90"/>
+        <w:ind w:left="340" w:hanging="340"/>
+        <w:jc w:val="both"/>
+      </w:pPr>
+      <w:r>
+        <w:rPr>
+          <w:rFonts w:ascii="Calibri" w:cs="Calibri" w:eastAsia="Calibri" w:hAnsi="Calibri"/>
+          <w:sz w:val="22"/>
+          <w:szCs w:val="22"/>
+        </w:rPr>
+        <w:t xml:space="preserve">•  </w:t>
+      </w:r>
+      <w:r>
+        <w:rPr>
+          <w:rFonts w:ascii="Calibri" w:cs="Calibri" w:eastAsia="Calibri" w:hAnsi="Calibri"/>
+          <w:sz w:val="22"/>
+          <w:szCs w:val="22"/>
+        </w:rPr>
+        <w:t xml:space="preserve">Configuração ou migração de domínio/hospedagem fora do escopo aprovado (pode ser orçada separadamente);</w:t>
+      </w:r>
+    </w:p>
+    <w:p>
+      <w:pPr>
+        <w:spacing w:after="90"/>
+        <w:ind w:left="340" w:hanging="340"/>
+        <w:jc w:val="both"/>
+      </w:pPr>
+      <w:r>
+        <w:rPr>
+          <w:rFonts w:ascii="Calibri" w:cs="Calibri" w:eastAsia="Calibri" w:hAnsi="Calibri"/>
+          <w:sz w:val="22"/>
+          <w:szCs w:val="22"/>
+        </w:rPr>
+        <w:t xml:space="preserve">•  </w:t>
+      </w:r>
+      <w:r>
+        <w:rPr>
+          <w:rFonts w:ascii="Calibri" w:cs="Calibri" w:eastAsia="Calibri" w:hAnsi="Calibri"/>
+          <w:sz w:val="22"/>
+          <w:szCs w:val="22"/>
+        </w:rPr>
+        <w:t xml:space="preserve">Criação de identidade visual (logotipo) do zero, quando não contratada;</w:t>
+      </w:r>
+    </w:p>
+    <w:p>
+      <w:pPr>
+        <w:spacing w:after="90"/>
+        <w:ind w:left="340" w:hanging="340"/>
+        <w:jc w:val="both"/>
+      </w:pPr>
+      <w:r>
+        <w:rPr>
+          <w:rFonts w:ascii="Calibri" w:cs="Calibri" w:eastAsia="Calibri" w:hAnsi="Calibri"/>
+          <w:sz w:val="22"/>
+          <w:szCs w:val="22"/>
+        </w:rPr>
+        <w:t xml:space="preserve">•  </w:t>
+      </w:r>
+      <w:r>
+        <w:rPr>
+          <w:rFonts w:ascii="Calibri" w:cs="Calibri" w:eastAsia="Calibri" w:hAnsi="Calibri"/>
+          <w:sz w:val="22"/>
+          <w:szCs w:val="22"/>
+        </w:rPr>
+        <w:t xml:space="preserve">Novas páginas ou funcionalidades fora do escopo marcado acima;</w:t>
+      </w:r>
+    </w:p>
+    <w:p>
+      <w:pPr>
+        <w:spacing w:after="90"/>
+        <w:ind w:left="340" w:hanging="340"/>
+        <w:jc w:val="both"/>
+      </w:pPr>
+      <w:r>
+        <w:rPr>
+          <w:rFonts w:ascii="Calibri" w:cs="Calibri" w:eastAsia="Calibri" w:hAnsi="Calibri"/>
+          <w:sz w:val="22"/>
+          <w:szCs w:val="22"/>
+        </w:rPr>
+        <w:t xml:space="preserve">•  </w:t>
+      </w:r>
+      <w:r>
+        <w:rPr>
+          <w:rFonts w:ascii="Calibri" w:cs="Calibri" w:eastAsia="Calibri" w:hAnsi="Calibri"/>
+          <w:sz w:val="22"/>
+          <w:szCs w:val="22"/>
+        </w:rPr>
+        <w:t xml:space="preserve">Integrações com sistemas de terceiros (CRM, pagamento, automação);</w:t>
+      </w:r>
+    </w:p>
+    <w:p>
+      <w:pPr>
+        <w:spacing w:after="90"/>
+        <w:ind w:left="340" w:hanging="340"/>
+        <w:jc w:val="both"/>
+      </w:pPr>
+      <w:r>
+        <w:rPr>
+          <w:rFonts w:ascii="Calibri" w:cs="Calibri" w:eastAsia="Calibri" w:hAnsi="Calibri"/>
+          <w:sz w:val="22"/>
+          <w:szCs w:val="22"/>
+        </w:rPr>
+        <w:t xml:space="preserve">•  </w:t>
+      </w:r>
+      <w:r>
+        <w:rPr>
+          <w:rFonts w:ascii="Calibri" w:cs="Calibri" w:eastAsia="Calibri" w:hAnsi="Calibri"/>
+          <w:sz w:val="22"/>
+          <w:szCs w:val="22"/>
+        </w:rPr>
+        <w:t xml:space="preserve">Produção de conteúdo (textos, fotos, vídeos) além do fornecido pelo cliente.</w:t>
+      </w:r>
     </w:p>
     <w:p>
       <w:pPr>
         <w:pStyle w:val="Heading1"/>
-        <w:spacing w:after="120" w:before="260"/>
-      </w:pPr>
-      <w:r>
+        <w:spacing w:after="130" w:before="260"/>
+      </w:pPr>
+      <w:r>
+        <w:rPr>
+          <w:rFonts w:ascii="Calibri" w:cs="Calibri" w:eastAsia="Calibri" w:hAnsi="Calibri"/>
+          <w:color w:val="2E74B5"/>
+          <w:sz w:val="28"/>
+          <w:szCs w:val="28"/>
+        </w:rPr>
         <w:t xml:space="preserve">Itens adicionais específicos deste cliente</w:t>
       </w:r>
     </w:p>
@@ -704,25 +869,32 @@
       <w:tr>
         <w:tc>
           <w:tcPr>
-            <w:tcW w:type="pct" w:w="20%"/>
-            <w:shd w:fill="1F2937" w:color="auto" w:val="clear"/>
+            <w:tcW w:type="pct" w:w="30%"/>
+            <w:tcBorders>
+              <w:top w:val="single" w:color="CCCCCC" w:sz="4"/>
+              <w:left w:val="single" w:color="CCCCCC" w:sz="4"/>
+              <w:bottom w:val="single" w:color="CCCCCC" w:sz="4"/>
+              <w:right w:val="single" w:color="CCCCCC" w:sz="4"/>
+            </w:tcBorders>
+            <w:shd w:fill="EEF3FA"/>
             <w:tcMar>
-              <w:top w:type="dxa" w:w="90"/>
-              <w:left w:type="dxa" w:w="110"/>
-              <w:bottom w:type="dxa" w:w="90"/>
-              <w:right w:type="dxa" w:w="110"/>
+              <w:top w:type="dxa" w:w="60"/>
+              <w:left w:type="dxa" w:w="100"/>
+              <w:bottom w:type="dxa" w:w="60"/>
+              <w:right w:type="dxa" w:w="100"/>
             </w:tcMar>
-            <w:vAlign w:val="center"/>
           </w:tcPr>
           <w:p>
+            <w:pPr>
+              <w:spacing w:after="40"/>
+            </w:pPr>
             <w:r>
               <w:rPr>
                 <w:rFonts w:ascii="Calibri" w:cs="Calibri" w:eastAsia="Calibri" w:hAnsi="Calibri"/>
                 <w:b/>
                 <w:bCs/>
-                <w:color w:val="FFFFFF"/>
-                <w:sz w:val="19"/>
-                <w:szCs w:val="19"/>
+                <w:sz w:val="22"/>
+                <w:szCs w:val="22"/>
               </w:rPr>
               <w:t xml:space="preserve">Item</w:t>
             </w:r>
@@ -730,25 +902,32 @@
         </w:tc>
         <w:tc>
           <w:tcPr>
-            <w:tcW w:type="pct" w:w="80%"/>
-            <w:shd w:fill="1F2937" w:color="auto" w:val="clear"/>
+            <w:tcW w:type="pct" w:w="70%"/>
+            <w:tcBorders>
+              <w:top w:val="single" w:color="CCCCCC" w:sz="4"/>
+              <w:left w:val="single" w:color="CCCCCC" w:sz="4"/>
+              <w:bottom w:val="single" w:color="CCCCCC" w:sz="4"/>
+              <w:right w:val="single" w:color="CCCCCC" w:sz="4"/>
+            </w:tcBorders>
+            <w:shd w:fill="EEF3FA"/>
             <w:tcMar>
-              <w:top w:type="dxa" w:w="90"/>
-              <w:left w:type="dxa" w:w="110"/>
-              <w:bottom w:type="dxa" w:w="90"/>
-              <w:right w:type="dxa" w:w="110"/>
+              <w:top w:type="dxa" w:w="60"/>
+              <w:left w:type="dxa" w:w="100"/>
+              <w:bottom w:type="dxa" w:w="60"/>
+              <w:right w:type="dxa" w:w="100"/>
             </w:tcMar>
-            <w:vAlign w:val="center"/>
           </w:tcPr>
           <w:p>
+            <w:pPr>
+              <w:spacing w:after="40"/>
+            </w:pPr>
             <w:r>
               <w:rPr>
                 <w:rFonts w:ascii="Calibri" w:cs="Calibri" w:eastAsia="Calibri" w:hAnsi="Calibri"/>
                 <w:b/>
                 <w:bCs/>
-                <w:color w:val="FFFFFF"/>
-                <w:sz w:val="19"/>
-                <w:szCs w:val="19"/>
+                <w:sz w:val="22"/>
+                <w:szCs w:val="22"/>
               </w:rPr>
               <w:t xml:space="preserve">Descrição</w:t>
             </w:r>
@@ -758,23 +937,29 @@
       <w:tr>
         <w:tc>
           <w:tcPr>
+            <w:tcW w:type="pct" w:w="30%"/>
+            <w:tcBorders>
+              <w:top w:val="single" w:color="CCCCCC" w:sz="4"/>
+              <w:left w:val="single" w:color="CCCCCC" w:sz="4"/>
+              <w:bottom w:val="single" w:color="CCCCCC" w:sz="4"/>
+              <w:right w:val="single" w:color="CCCCCC" w:sz="4"/>
+            </w:tcBorders>
             <w:tcMar>
-              <w:top w:type="dxa" w:w="90"/>
-              <w:left w:type="dxa" w:w="110"/>
-              <w:bottom w:type="dxa" w:w="90"/>
-              <w:right w:type="dxa" w:w="110"/>
+              <w:top w:type="dxa" w:w="60"/>
+              <w:left w:type="dxa" w:w="100"/>
+              <w:bottom w:type="dxa" w:w="60"/>
+              <w:right w:type="dxa" w:w="100"/>
             </w:tcMar>
-            <w:vAlign w:val="center"/>
           </w:tcPr>
           <w:p>
+            <w:pPr>
+              <w:spacing w:after="40"/>
+            </w:pPr>
             <w:r>
               <w:rPr>
                 <w:rFonts w:ascii="Calibri" w:cs="Calibri" w:eastAsia="Calibri" w:hAnsi="Calibri"/>
-                <w:b w:val="false"/>
-                <w:bCs w:val="false"/>
-                <w:color w:val="000000"/>
-                <w:sz w:val="20"/>
-                <w:szCs w:val="20"/>
+                <w:sz w:val="22"/>
+                <w:szCs w:val="22"/>
               </w:rPr>
               <w:t xml:space="preserve">{#additionalItems}{item}</w:t>
             </w:r>
@@ -782,23 +967,29 @@
         </w:tc>
         <w:tc>
           <w:tcPr>
+            <w:tcW w:type="pct" w:w="70%"/>
+            <w:tcBorders>
+              <w:top w:val="single" w:color="CCCCCC" w:sz="4"/>
+              <w:left w:val="single" w:color="CCCCCC" w:sz="4"/>
+              <w:bottom w:val="single" w:color="CCCCCC" w:sz="4"/>
+              <w:right w:val="single" w:color="CCCCCC" w:sz="4"/>
+            </w:tcBorders>
             <w:tcMar>
-              <w:top w:type="dxa" w:w="90"/>
-              <w:left w:type="dxa" w:w="110"/>
-              <w:bottom w:type="dxa" w:w="90"/>
-              <w:right w:type="dxa" w:w="110"/>
+              <w:top w:type="dxa" w:w="60"/>
+              <w:left w:type="dxa" w:w="100"/>
+              <w:bottom w:type="dxa" w:w="60"/>
+              <w:right w:type="dxa" w:w="100"/>
             </w:tcMar>
-            <w:vAlign w:val="center"/>
           </w:tcPr>
           <w:p>
+            <w:pPr>
+              <w:spacing w:after="40"/>
+            </w:pPr>
             <w:r>
               <w:rPr>
                 <w:rFonts w:ascii="Calibri" w:cs="Calibri" w:eastAsia="Calibri" w:hAnsi="Calibri"/>
-                <w:b w:val="false"/>
-                <w:bCs w:val="false"/>
-                <w:color w:val="000000"/>
-                <w:sz w:val="20"/>
-                <w:szCs w:val="20"/>
+                <w:sz w:val="22"/>
+                <w:szCs w:val="22"/>
               </w:rPr>
               <w:t xml:space="preserve">{description}{/}</w:t>
             </w:r>
@@ -808,21 +999,27 @@
     </w:tbl>
     <w:p>
       <w:pPr>
-        <w:spacing w:before="220"/>
+        <w:spacing w:after="160"/>
       </w:pPr>
     </w:p>
     <w:p>
       <w:pPr>
         <w:pStyle w:val="Heading1"/>
-        <w:spacing w:after="120" w:before="260"/>
-      </w:pPr>
-      <w:r>
+        <w:spacing w:after="130" w:before="260"/>
+      </w:pPr>
+      <w:r>
+        <w:rPr>
+          <w:rFonts w:ascii="Calibri" w:cs="Calibri" w:eastAsia="Calibri" w:hAnsi="Calibri"/>
+          <w:color w:val="2E74B5"/>
+          <w:sz w:val="28"/>
+          <w:szCs w:val="28"/>
+        </w:rPr>
         <w:t xml:space="preserve">Valor e forma de pagamento</w:t>
       </w:r>
     </w:p>
     <w:p>
       <w:pPr>
-        <w:spacing w:after="130"/>
+        <w:spacing w:after="160"/>
         <w:jc w:val="both"/>
       </w:pPr>
       <w:r>
@@ -838,7 +1035,7 @@
     </w:p>
     <w:p>
       <w:pPr>
-        <w:spacing w:after="130"/>
+        <w:spacing w:after="160"/>
         <w:jc w:val="both"/>
       </w:pPr>
       <w:r>
@@ -852,38 +1049,60 @@
     </w:p>
     <w:p>
       <w:pPr>
-        <w:spacing w:after="60"/>
-      </w:pPr>
-      <w:r>
-        <w:rPr>
-          <w:rFonts w:ascii="Calibri" w:cs="Calibri" w:eastAsia="Calibri" w:hAnsi="Calibri"/>
-          <w:sz w:val="22"/>
-          <w:szCs w:val="22"/>
-        </w:rPr>
-        <w:t xml:space="preserve">• 50% no momento da aprovação deste orçamento, como condição para o início do desenvolvimento;</w:t>
-      </w:r>
-    </w:p>
-    <w:p>
-      <w:pPr>
-        <w:spacing w:after="60"/>
-      </w:pPr>
-      <w:r>
-        <w:rPr>
-          <w:rFonts w:ascii="Calibri" w:cs="Calibri" w:eastAsia="Calibri" w:hAnsi="Calibri"/>
-          <w:sz w:val="22"/>
-          <w:szCs w:val="22"/>
-        </w:rPr>
-        <w:t xml:space="preserve">• 50% na entrega final do site.</w:t>
-      </w:r>
-    </w:p>
-    <w:p>
-      <w:pPr>
-        <w:spacing w:after="130"/>
-        <w:jc w:val="both"/>
-      </w:pPr>
-      <w:r>
-        <w:rPr>
-          <w:rFonts w:ascii="Calibri" w:cs="Calibri" w:eastAsia="Calibri" w:hAnsi="Calibri"/>
+        <w:spacing w:after="90"/>
+        <w:ind w:left="340" w:hanging="340"/>
+        <w:jc w:val="both"/>
+      </w:pPr>
+      <w:r>
+        <w:rPr>
+          <w:rFonts w:ascii="Calibri" w:cs="Calibri" w:eastAsia="Calibri" w:hAnsi="Calibri"/>
+          <w:sz w:val="22"/>
+          <w:szCs w:val="22"/>
+        </w:rPr>
+        <w:t xml:space="preserve">•  </w:t>
+      </w:r>
+      <w:r>
+        <w:rPr>
+          <w:rFonts w:ascii="Calibri" w:cs="Calibri" w:eastAsia="Calibri" w:hAnsi="Calibri"/>
+          <w:sz w:val="22"/>
+          <w:szCs w:val="22"/>
+        </w:rPr>
+        <w:t xml:space="preserve">50% no momento da aprovação deste orçamento, como condição para o início do desenvolvimento;</w:t>
+      </w:r>
+    </w:p>
+    <w:p>
+      <w:pPr>
+        <w:spacing w:after="90"/>
+        <w:ind w:left="340" w:hanging="340"/>
+        <w:jc w:val="both"/>
+      </w:pPr>
+      <w:r>
+        <w:rPr>
+          <w:rFonts w:ascii="Calibri" w:cs="Calibri" w:eastAsia="Calibri" w:hAnsi="Calibri"/>
+          <w:sz w:val="22"/>
+          <w:szCs w:val="22"/>
+        </w:rPr>
+        <w:t xml:space="preserve">•  </w:t>
+      </w:r>
+      <w:r>
+        <w:rPr>
+          <w:rFonts w:ascii="Calibri" w:cs="Calibri" w:eastAsia="Calibri" w:hAnsi="Calibri"/>
+          <w:sz w:val="22"/>
+          <w:szCs w:val="22"/>
+        </w:rPr>
+        <w:t xml:space="preserve">50% na entrega final do site.</w:t>
+      </w:r>
+    </w:p>
+    <w:p>
+      <w:pPr>
+        <w:spacing w:after="160"/>
+        <w:jc w:val="both"/>
+      </w:pPr>
+      <w:r>
+        <w:rPr>
+          <w:rFonts w:ascii="Calibri" w:cs="Calibri" w:eastAsia="Calibri" w:hAnsi="Calibri"/>
+          <w:i/>
+          <w:iCs/>
           <w:sz w:val="22"/>
           <w:szCs w:val="22"/>
         </w:rPr>
@@ -893,15 +1112,21 @@
     <w:p>
       <w:pPr>
         <w:pStyle w:val="Heading1"/>
-        <w:spacing w:after="120" w:before="260"/>
-      </w:pPr>
-      <w:r>
+        <w:spacing w:after="130" w:before="260"/>
+      </w:pPr>
+      <w:r>
+        <w:rPr>
+          <w:rFonts w:ascii="Calibri" w:cs="Calibri" w:eastAsia="Calibri" w:hAnsi="Calibri"/>
+          <w:color w:val="2E74B5"/>
+          <w:sz w:val="28"/>
+          <w:szCs w:val="28"/>
+        </w:rPr>
         <w:t xml:space="preserve">Manutenção (opcional)</w:t>
       </w:r>
     </w:p>
     <w:p>
       <w:pPr>
-        <w:spacing w:after="130"/>
+        <w:spacing w:after="160"/>
         <w:jc w:val="both"/>
       </w:pPr>
       <w:r>
@@ -916,20 +1141,28 @@
     <w:p>
       <w:pPr>
         <w:pStyle w:val="Heading1"/>
-        <w:spacing w:after="120" w:before="260"/>
-      </w:pPr>
-      <w:r>
+        <w:spacing w:after="130" w:before="260"/>
+      </w:pPr>
+      <w:r>
+        <w:rPr>
+          <w:rFonts w:ascii="Calibri" w:cs="Calibri" w:eastAsia="Calibri" w:hAnsi="Calibri"/>
+          <w:color w:val="2E74B5"/>
+          <w:sz w:val="28"/>
+          <w:szCs w:val="28"/>
+        </w:rPr>
         <w:t xml:space="preserve">Observações</w:t>
       </w:r>
     </w:p>
     <w:p>
       <w:pPr>
-        <w:spacing w:after="130"/>
-        <w:jc w:val="both"/>
-      </w:pPr>
-      <w:r>
-        <w:rPr>
-          <w:rFonts w:ascii="Calibri" w:cs="Calibri" w:eastAsia="Calibri" w:hAnsi="Calibri"/>
+        <w:spacing w:after="160"/>
+        <w:jc w:val="both"/>
+      </w:pPr>
+      <w:r>
+        <w:rPr>
+          <w:rFonts w:ascii="Calibri" w:cs="Calibri" w:eastAsia="Calibri" w:hAnsi="Calibri"/>
+          <w:i/>
+          <w:iCs/>
           <w:sz w:val="22"/>
           <w:szCs w:val="22"/>
         </w:rPr>
@@ -939,15 +1172,21 @@
     <w:p>
       <w:pPr>
         <w:pStyle w:val="Heading1"/>
-        <w:spacing w:after="120" w:before="260"/>
-      </w:pPr>
-      <w:r>
+        <w:spacing w:after="130" w:before="260"/>
+      </w:pPr>
+      <w:r>
+        <w:rPr>
+          <w:rFonts w:ascii="Calibri" w:cs="Calibri" w:eastAsia="Calibri" w:hAnsi="Calibri"/>
+          <w:color w:val="2E74B5"/>
+          <w:sz w:val="28"/>
+          <w:szCs w:val="28"/>
+        </w:rPr>
         <w:t xml:space="preserve">Aceite</w:t>
       </w:r>
     </w:p>
     <w:p>
       <w:pPr>
-        <w:spacing w:after="130"/>
+        <w:spacing w:after="160"/>
         <w:jc w:val="both"/>
       </w:pPr>
       <w:r>
@@ -961,20 +1200,15 @@
     </w:p>
     <w:p>
       <w:pPr>
-        <w:spacing w:before="380"/>
-      </w:pPr>
-    </w:p>
-    <w:p>
-      <w:pPr>
-        <w:spacing w:after="40"/>
-      </w:pPr>
-      <w:r>
-        <w:rPr>
-          <w:rFonts w:ascii="Calibri" w:cs="Calibri" w:eastAsia="Calibri" w:hAnsi="Calibri"/>
-          <w:sz w:val="22"/>
-          <w:szCs w:val="22"/>
-        </w:rPr>
-        <w:t xml:space="preserve">_________________________________________________</w:t>
+        <w:spacing w:after="40" w:before="300"/>
+      </w:pPr>
+      <w:r>
+        <w:rPr>
+          <w:rFonts w:ascii="Calibri" w:cs="Calibri" w:eastAsia="Calibri" w:hAnsi="Calibri"/>
+          <w:sz w:val="22"/>
+          <w:szCs w:val="22"/>
+        </w:rPr>
+        <w:t xml:space="preserve">_______________________________________________</w:t>
       </w:r>
     </w:p>
     <w:p>
@@ -1123,7 +1357,7 @@
         <w:sz w:val="16"/>
         <w:szCs w:val="16"/>
       </w:rPr>
-      <w:t xml:space="preserve">ēloSites — Orçamento (modelo padrão)</w:t>
+      <w:t xml:space="preserve">ēloSites — Orçamento de Desenvolvimento de Site</w:t>
     </w:r>
   </w:p>
 </w:hdr>

</xml_diff>